<commit_message>
Fixed camera and button outputs
Fixed the player not moving in the correct orientation by changing the position of the greyboxed environment. Also added the actual completed GDD document.
</commit_message>
<xml_diff>
--- a/Third-Person Project GDD Template COMPLETE.docx
+++ b/Third-Person Project GDD Template COMPLETE.docx
@@ -141,8 +141,13 @@
       </w:pPr>
       <w:bookmarkStart w:id="0" w:name="_2gazcsgmxkub" w:colFirst="0" w:colLast="0"/>
       <w:bookmarkEnd w:id="0"/>
-      <w:r>
-        <w:t>*Goblin Dungeon* working title</w:t>
+      <w:proofErr w:type="spellStart"/>
+      <w:r>
+        <w:t>Splatty</w:t>
+      </w:r>
+      <w:proofErr w:type="spellEnd"/>
+      <w:r>
+        <w:t xml:space="preserve"> the goblin gets a job in a dungeon</w:t>
       </w:r>
     </w:p>
     <w:p>
@@ -198,6 +203,7 @@
       <w:bookmarkStart w:id="2" w:name="_o72s15mtq0x3" w:colFirst="0" w:colLast="0"/>
       <w:bookmarkEnd w:id="2"/>
       <w:r>
+        <w:lastRenderedPageBreak/>
         <w:br w:type="page"/>
       </w:r>
     </w:p>
@@ -1122,12 +1128,47 @@
     </w:p>
     <w:p>
       <w:r>
-        <w:t>&lt;A one sentence pitch for your game&gt;</w:t>
-      </w:r>
-    </w:p>
-    <w:p>
-      <w:r>
         <w:t xml:space="preserve">Pretend that you are pitching your game to an executive in an elevator.  You have less than 60 seconds. </w:t>
+      </w:r>
+    </w:p>
+    <w:p>
+      <w:r>
+        <w:t xml:space="preserve">Our game </w:t>
+      </w:r>
+      <w:r>
+        <w:t>“</w:t>
+      </w:r>
+      <w:proofErr w:type="spellStart"/>
+      <w:r>
+        <w:t>Splatty</w:t>
+      </w:r>
+      <w:proofErr w:type="spellEnd"/>
+      <w:r>
+        <w:t xml:space="preserve"> the Goblin Gets a Job in a Dungeon”</w:t>
+      </w:r>
+      <w:r>
+        <w:t xml:space="preserve"> </w:t>
+      </w:r>
+      <w:r>
+        <w:t>puts you in</w:t>
+      </w:r>
+      <w:r>
+        <w:t xml:space="preserve"> the</w:t>
+      </w:r>
+      <w:r>
+        <w:t xml:space="preserve"> shoes of a little goblin tasked with resetting all of the traps in their master’s dungeon</w:t>
+      </w:r>
+      <w:r>
+        <w:t xml:space="preserve">, however you must go back through the dungeon after your work is done, </w:t>
+      </w:r>
+      <w:r>
+        <w:t xml:space="preserve">deftly dodging the now </w:t>
+      </w:r>
+      <w:r>
+        <w:t xml:space="preserve">primed and ready </w:t>
+      </w:r>
+      <w:r>
+        <w:t>obstacles to make it back to the entrance.</w:t>
       </w:r>
     </w:p>
     <w:p/>
@@ -1217,15 +1258,13 @@
         <w:spacing w:before="0"/>
       </w:pPr>
       <w:r>
-        <w:t xml:space="preserve">Art style, silly </w:t>
-      </w:r>
-      <w:proofErr w:type="gramStart"/>
-      <w:r>
-        <w:t>factor</w:t>
-      </w:r>
-      <w:proofErr w:type="gramEnd"/>
-      <w:r>
-        <w:t>, cartoon visuals, general comedy beats</w:t>
+        <w:t>Art style, sill</w:t>
+      </w:r>
+      <w:r>
+        <w:t>iness</w:t>
+      </w:r>
+      <w:r>
+        <w:t xml:space="preserve"> factor, cartoon visuals, general comedy beats</w:t>
       </w:r>
     </w:p>
     <w:p>
@@ -1256,23 +1295,74 @@
         <w:spacing w:before="0"/>
       </w:pPr>
       <w:r>
-        <w:t xml:space="preserve">Camera angle, art style </w:t>
-      </w:r>
-      <w:proofErr w:type="spellStart"/>
-      <w:r>
-        <w:t>inspo</w:t>
-      </w:r>
-      <w:proofErr w:type="spellEnd"/>
-      <w:r>
-        <w:t xml:space="preserve">, platforming </w:t>
-      </w:r>
-      <w:proofErr w:type="spellStart"/>
-      <w:r>
-        <w:t>mechanicsm</w:t>
-      </w:r>
-      <w:proofErr w:type="spellEnd"/>
-      <w:r>
-        <w:t xml:space="preserve"> etc.</w:t>
+        <w:t>Camera angle</w:t>
+      </w:r>
+      <w:r>
+        <w:t xml:space="preserve"> (</w:t>
+      </w:r>
+      <w:r>
+        <w:t>fixed</w:t>
+      </w:r>
+      <w:r>
+        <w:t xml:space="preserve">, with player running away from / to the camera </w:t>
+      </w:r>
+      <w:r>
+        <w:t xml:space="preserve">with the Up / Down </w:t>
+      </w:r>
+      <w:r>
+        <w:t>buttons</w:t>
+      </w:r>
+      <w:r>
+        <w:t>)</w:t>
+      </w:r>
+      <w:r>
+        <w:t>, art style insp</w:t>
+      </w:r>
+      <w:r>
+        <w:t xml:space="preserve">iration with respect to the early </w:t>
+      </w:r>
+      <w:r>
+        <w:t xml:space="preserve">PS1 / PS2 </w:t>
+      </w:r>
+      <w:r>
+        <w:t>low-poly graphics</w:t>
+      </w:r>
+      <w:r>
+        <w:t>,</w:t>
+      </w:r>
+      <w:r>
+        <w:t xml:space="preserve"> platforming</w:t>
+      </w:r>
+      <w:r>
+        <w:t xml:space="preserve"> </w:t>
+      </w:r>
+      <w:r>
+        <w:t xml:space="preserve">by way of running and jumping over and around obstacles and setting off certain </w:t>
+      </w:r>
+      <w:r>
+        <w:t>traps to get through them</w:t>
+      </w:r>
+      <w:r>
+        <w:t>.</w:t>
+      </w:r>
+    </w:p>
+    <w:p>
+      <w:pPr>
+        <w:pStyle w:val="Heading3"/>
+      </w:pPr>
+      <w:r>
+        <w:t>Little big planet</w:t>
+      </w:r>
+    </w:p>
+    <w:p>
+      <w:pPr>
+        <w:numPr>
+          <w:ilvl w:val="0"/>
+          <w:numId w:val="2"/>
+        </w:numPr>
+      </w:pPr>
+      <w:r>
+        <w:t xml:space="preserve">Game </w:t>
       </w:r>
     </w:p>
     <w:p>
@@ -1284,7 +1374,34 @@
         <w:spacing w:before="0"/>
       </w:pPr>
       <w:r>
-        <w:t>Explain why this is an influence in one paragraph or less</w:t>
+        <w:lastRenderedPageBreak/>
+        <w:t xml:space="preserve">for </w:t>
+      </w:r>
+      <w:proofErr w:type="spellStart"/>
+      <w:r>
+        <w:t>utilising</w:t>
+      </w:r>
+      <w:proofErr w:type="spellEnd"/>
+      <w:r>
+        <w:t xml:space="preserve"> some minor </w:t>
+      </w:r>
+      <w:r>
+        <w:t>fine motor</w:t>
+      </w:r>
+      <w:r>
+        <w:t xml:space="preserve"> skills for </w:t>
+      </w:r>
+      <w:r>
+        <w:t>puzzle-solving mechanics</w:t>
+      </w:r>
+      <w:r>
+        <w:t xml:space="preserve"> </w:t>
+      </w:r>
+      <w:r>
+        <w:t xml:space="preserve">i.e. </w:t>
+      </w:r>
+      <w:r>
+        <w:t xml:space="preserve">grabbing at and picking up items to use within the environment. </w:t>
       </w:r>
     </w:p>
     <w:p>
@@ -1292,7 +1409,7 @@
         <w:pStyle w:val="Heading3"/>
       </w:pPr>
       <w:r>
-        <w:t>Little big planet</w:t>
+        <w:t>Elder Scrolls 5: Skyrim</w:t>
       </w:r>
     </w:p>
     <w:p>
@@ -1315,7 +1432,13 @@
         <w:spacing w:before="0"/>
       </w:pPr>
       <w:r>
-        <w:t>For the grabbing action</w:t>
+        <w:t xml:space="preserve">Layout of dungeons and </w:t>
+      </w:r>
+      <w:r>
+        <w:t>complexity of the traps that lie within. Trap designs</w:t>
+      </w:r>
+      <w:r>
+        <w:t>.</w:t>
       </w:r>
     </w:p>
     <w:p/>
@@ -1397,13 +1520,14 @@
           <w:numId w:val="1"/>
         </w:numPr>
       </w:pPr>
-      <w:proofErr w:type="gramStart"/>
-      <w:r>
-        <w:t>general</w:t>
-      </w:r>
-      <w:proofErr w:type="gramEnd"/>
-      <w:r>
-        <w:t xml:space="preserve"> grabbing motion</w:t>
+      <w:r>
+        <w:t>A g</w:t>
+      </w:r>
+      <w:r>
+        <w:t>eneral grabbing motion</w:t>
+      </w:r>
+      <w:r>
+        <w:t xml:space="preserve"> to pick up and interact with objects</w:t>
       </w:r>
     </w:p>
     <w:p/>
@@ -1425,21 +1549,7 @@
         </w:numPr>
       </w:pPr>
       <w:r>
-        <w:t>&lt;Hazard #1</w:t>
-      </w:r>
-      <w:r>
-        <w:t xml:space="preserve"> (Static)</w:t>
-      </w:r>
-      <w:proofErr w:type="gramStart"/>
-      <w:r>
-        <w:t>&gt;</w:t>
-      </w:r>
-      <w:r>
-        <w:t xml:space="preserve"> **</w:t>
-      </w:r>
-      <w:proofErr w:type="gramEnd"/>
-      <w:r>
-        <w:t>**</w:t>
+        <w:t>Spikes on the ground (static) – trap door that opens onto the spikes (dynamic)</w:t>
       </w:r>
     </w:p>
     <w:p>
@@ -1450,32 +1560,17 @@
         </w:numPr>
       </w:pPr>
       <w:r>
-        <w:t>&lt;Hazard #2 (Dynamic)&gt;</w:t>
-      </w:r>
-    </w:p>
-    <w:p/>
-    <w:p>
-      <w:pPr>
-        <w:pStyle w:val="Heading1"/>
-      </w:pPr>
-      <w:bookmarkStart w:id="12" w:name="_Toc200879215"/>
-      <w:r>
-        <w:t xml:space="preserve">Visual </w:t>
-      </w:r>
-      <w:r>
-        <w:t>Assets</w:t>
-      </w:r>
-      <w:bookmarkEnd w:id="12"/>
-    </w:p>
-    <w:p>
-      <w:pPr>
-        <w:pStyle w:val="Heading2"/>
-      </w:pPr>
-      <w:bookmarkStart w:id="13" w:name="_Toc200879216"/>
-      <w:r>
-        <w:t>Asset list</w:t>
-      </w:r>
-      <w:bookmarkEnd w:id="13"/>
+        <w:t xml:space="preserve">Swinging saw </w:t>
+      </w:r>
+      <w:r>
+        <w:t>(dynamic)</w:t>
+      </w:r>
+      <w:r>
+        <w:t xml:space="preserve"> – is triggered from a tripwire or </w:t>
+      </w:r>
+      <w:r>
+        <w:t>pressure pad</w:t>
+      </w:r>
     </w:p>
     <w:p>
       <w:pPr>
@@ -1485,29 +1580,24 @@
         </w:numPr>
       </w:pPr>
       <w:r>
-        <w:t>Dungeon assets from unity class, new goblin textures, new traps (models and textures), *****</w:t>
-      </w:r>
-    </w:p>
-    <w:p/>
-    <w:p>
-      <w:pPr>
-        <w:pStyle w:val="Heading2"/>
-      </w:pPr>
-    </w:p>
-    <w:p>
-      <w:pPr>
-        <w:pStyle w:val="Heading2"/>
-      </w:pPr>
-    </w:p>
-    <w:p>
-      <w:pPr>
-        <w:pStyle w:val="Heading2"/>
-      </w:pPr>
-      <w:bookmarkStart w:id="14" w:name="_Toc200879217"/>
-      <w:r>
-        <w:t>Mood board</w:t>
-      </w:r>
-      <w:bookmarkEnd w:id="14"/>
+        <w:lastRenderedPageBreak/>
+        <w:t xml:space="preserve">Acid pit / acid spill (static) </w:t>
+      </w:r>
+      <w:r>
+        <w:t>–</w:t>
+      </w:r>
+      <w:r>
+        <w:t xml:space="preserve"> </w:t>
+      </w:r>
+      <w:r>
+        <w:t xml:space="preserve">puddles of acid that must be </w:t>
+      </w:r>
+      <w:r>
+        <w:t xml:space="preserve">mopped up by the </w:t>
+      </w:r>
+      <w:r>
+        <w:t>player</w:t>
+      </w:r>
     </w:p>
     <w:p>
       <w:pPr>
@@ -1517,17 +1607,190 @@
         </w:numPr>
       </w:pPr>
       <w:r>
+        <w:t xml:space="preserve">Firing arrows (dynamic) – the player must pluck them from the wall and </w:t>
+      </w:r>
+      <w:r>
+        <w:t xml:space="preserve">reset the </w:t>
+      </w:r>
+      <w:r>
+        <w:t>contraptions they shoot out of.</w:t>
+      </w:r>
+    </w:p>
+    <w:p/>
+    <w:p>
+      <w:pPr>
+        <w:pStyle w:val="Heading1"/>
+      </w:pPr>
+      <w:bookmarkStart w:id="12" w:name="_Toc200879215"/>
+      <w:r>
+        <w:t xml:space="preserve">Visual </w:t>
+      </w:r>
+      <w:r>
+        <w:t>Assets</w:t>
+      </w:r>
+      <w:bookmarkEnd w:id="12"/>
+    </w:p>
+    <w:p>
+      <w:pPr>
+        <w:pStyle w:val="Heading2"/>
+      </w:pPr>
+      <w:bookmarkStart w:id="13" w:name="_Toc200879216"/>
+      <w:r>
+        <w:t>Asset list</w:t>
+      </w:r>
+      <w:bookmarkEnd w:id="13"/>
+    </w:p>
+    <w:p>
+      <w:pPr>
+        <w:numPr>
+          <w:ilvl w:val="0"/>
+          <w:numId w:val="1"/>
+        </w:numPr>
+      </w:pPr>
+      <w:r>
+        <w:t>Creating a new dungeon in unity</w:t>
+      </w:r>
+    </w:p>
+    <w:p>
+      <w:pPr>
+        <w:numPr>
+          <w:ilvl w:val="0"/>
+          <w:numId w:val="1"/>
+        </w:numPr>
+      </w:pPr>
+      <w:r>
+        <w:t xml:space="preserve">Modelling a goblin in </w:t>
+      </w:r>
+      <w:r>
+        <w:t>Maya</w:t>
+      </w:r>
+    </w:p>
+    <w:p>
+      <w:pPr>
+        <w:numPr>
+          <w:ilvl w:val="0"/>
+          <w:numId w:val="1"/>
+        </w:numPr>
+      </w:pPr>
+      <w:r>
+        <w:t>Modelling traps in Maya</w:t>
+      </w:r>
+    </w:p>
+    <w:p>
+      <w:pPr>
+        <w:numPr>
+          <w:ilvl w:val="0"/>
+          <w:numId w:val="1"/>
+        </w:numPr>
+      </w:pPr>
+      <w:r>
+        <w:t xml:space="preserve">Creating textures to apply to the environs and </w:t>
+      </w:r>
+      <w:r>
+        <w:t xml:space="preserve">the player character / </w:t>
+      </w:r>
+      <w:r>
+        <w:t>trap models.</w:t>
+      </w:r>
+    </w:p>
+    <w:p/>
+    <w:p>
+      <w:pPr>
+        <w:pStyle w:val="Heading2"/>
+      </w:pPr>
+    </w:p>
+    <w:p>
+      <w:pPr>
+        <w:pStyle w:val="Heading2"/>
+      </w:pPr>
+    </w:p>
+    <w:p/>
+    <w:p/>
+    <w:p/>
+    <w:p/>
+    <w:p/>
+    <w:p/>
+    <w:p/>
+    <w:p/>
+    <w:p/>
+    <w:p>
+      <w:pPr>
+        <w:pStyle w:val="Heading2"/>
+      </w:pPr>
+      <w:bookmarkStart w:id="14" w:name="_Toc200879217"/>
+      <w:r>
+        <w:lastRenderedPageBreak/>
+        <w:t>Mood board</w:t>
+      </w:r>
+      <w:bookmarkEnd w:id="14"/>
+    </w:p>
+    <w:p>
+      <w:pPr>
+        <w:numPr>
+          <w:ilvl w:val="0"/>
+          <w:numId w:val="1"/>
+        </w:numPr>
+      </w:pPr>
+      <w:r>
         <w:t>&lt;Include a minimum of 6 images as reference/inspiration for the aesthetic of your game&gt;</w:t>
+      </w:r>
+    </w:p>
+    <w:p>
+      <w:r>
+        <w:rPr>
+          <w:noProof/>
+        </w:rPr>
+        <w:drawing>
+          <wp:inline distT="0" distB="0" distL="0" distR="0" wp14:anchorId="633BB494" wp14:editId="514EE29A">
+            <wp:extent cx="5943600" cy="4552950"/>
+            <wp:effectExtent l="0" t="0" r="0" b="0"/>
+            <wp:docPr id="1047447449" name="drawing"/>
+            <wp:cNvGraphicFramePr>
+              <a:graphicFrameLocks xmlns:a="http://schemas.openxmlformats.org/drawingml/2006/main" noChangeAspect="1"/>
+            </wp:cNvGraphicFramePr>
+            <a:graphic xmlns:a="http://schemas.openxmlformats.org/drawingml/2006/main">
+              <a:graphicData uri="http://schemas.openxmlformats.org/drawingml/2006/picture">
+                <pic:pic xmlns:pic="http://schemas.openxmlformats.org/drawingml/2006/picture">
+                  <pic:nvPicPr>
+                    <pic:cNvPr id="1047447449" name="Picture 1047447449"/>
+                    <pic:cNvPicPr/>
+                  </pic:nvPicPr>
+                  <pic:blipFill>
+                    <a:blip r:embed="rId8">
+                      <a:extLst>
+                        <a:ext uri="{28A0092B-C50C-407E-A947-70E740481C1C}">
+                          <a14:useLocalDpi xmlns:a14="http://schemas.microsoft.com/office/drawing/2010/main"/>
+                        </a:ext>
+                      </a:extLst>
+                    </a:blip>
+                    <a:stretch>
+                      <a:fillRect/>
+                    </a:stretch>
+                  </pic:blipFill>
+                  <pic:spPr>
+                    <a:xfrm>
+                      <a:off x="0" y="0"/>
+                      <a:ext cx="5943600" cy="4552950"/>
+                    </a:xfrm>
+                    <a:prstGeom prst="rect">
+                      <a:avLst/>
+                    </a:prstGeom>
+                  </pic:spPr>
+                </pic:pic>
+              </a:graphicData>
+            </a:graphic>
+          </wp:inline>
+        </w:drawing>
       </w:r>
     </w:p>
     <w:p/>
     <w:sectPr>
-      <w:headerReference w:type="even" r:id="rId8"/>
-      <w:headerReference w:type="default" r:id="rId9"/>
-      <w:footerReference w:type="even" r:id="rId10"/>
-      <w:footerReference w:type="default" r:id="rId11"/>
-      <w:headerReference w:type="first" r:id="rId12"/>
-      <w:footerReference w:type="first" r:id="rId13"/>
+      <w:headerReference w:type="even" r:id="rId9"/>
+      <w:headerReference w:type="default" r:id="rId10"/>
+      <w:footerReference w:type="even" r:id="rId11"/>
+      <w:footerReference w:type="default" r:id="rId12"/>
+      <w:headerReference w:type="first" r:id="rId13"/>
+      <w:footerReference w:type="first" r:id="rId14"/>
       <w:pgSz w:w="12240" w:h="15840"/>
       <w:pgMar w:top="1080" w:right="1440" w:bottom="1080" w:left="1440" w:header="0" w:footer="720" w:gutter="0"/>
       <w:pgNumType w:start="1"/>
@@ -1576,7 +1839,7 @@
       <mc:AlternateContent>
         <mc:Choice Requires="wps">
           <w:drawing>
-            <wp:anchor distT="0" distB="0" distL="0" distR="0" simplePos="0" relativeHeight="251665408" behindDoc="0" locked="0" layoutInCell="1" allowOverlap="1" wp14:anchorId="5FBEC35E" wp14:editId="12D8D3AE">
+            <wp:anchor distT="0" distB="0" distL="0" distR="0" simplePos="0" relativeHeight="251658246" behindDoc="0" locked="0" layoutInCell="1" allowOverlap="1" wp14:anchorId="5FBEC35E" wp14:editId="12D8D3AE">
               <wp:simplePos x="635" y="635"/>
               <wp:positionH relativeFrom="page">
                 <wp:align>center</wp:align>
@@ -1655,7 +1918,7 @@
               <v:stroke joinstyle="miter"/>
               <v:path gradientshapeok="t" o:connecttype="rect"/>
             </v:shapetype>
-            <v:shape id="Text Box 10" o:spid="_x0000_s1028" type="#_x0000_t202" alt="OFFICIAL" style="position:absolute;margin-left:0;margin-top:0;width:34.95pt;height:34.95pt;z-index:251665408;visibility:visible;mso-wrap-style:none;mso-wrap-distance-left:0;mso-wrap-distance-top:0;mso-wrap-distance-right:0;mso-wrap-distance-bottom:0;mso-position-horizontal:center;mso-position-horizontal-relative:page;mso-position-vertical:bottom;mso-position-vertical-relative:page;v-text-anchor:bottom" o:gfxdata="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" filled="f" stroked="f">
+            <v:shape id="Text Box 10" o:spid="_x0000_s1028" type="#_x0000_t202" alt="OFFICIAL" style="position:absolute;margin-left:0;margin-top:0;width:34.95pt;height:34.95pt;z-index:251658246;visibility:visible;mso-wrap-style:none;mso-wrap-distance-left:0;mso-wrap-distance-top:0;mso-wrap-distance-right:0;mso-wrap-distance-bottom:0;mso-position-horizontal:center;mso-position-horizontal-relative:page;mso-position-vertical:bottom;mso-position-vertical-relative:page;v-text-anchor:bottom" o:gfxdata="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" filled="f" stroked="f">
               <v:textbox style="mso-fit-shape-to-text:t" inset="0,0,0,15pt">
                 <w:txbxContent>
                   <w:p>
@@ -1715,7 +1978,7 @@
       <mc:AlternateContent>
         <mc:Choice Requires="wps">
           <w:drawing>
-            <wp:anchor distT="0" distB="0" distL="0" distR="0" simplePos="0" relativeHeight="251666432" behindDoc="0" locked="0" layoutInCell="1" allowOverlap="1" wp14:anchorId="73C969FC" wp14:editId="2C9490BC">
+            <wp:anchor distT="0" distB="0" distL="0" distR="0" simplePos="0" relativeHeight="251658247" behindDoc="0" locked="0" layoutInCell="1" allowOverlap="1" wp14:anchorId="73C969FC" wp14:editId="2C9490BC">
               <wp:simplePos x="914400" y="9001125"/>
               <wp:positionH relativeFrom="page">
                 <wp:align>center</wp:align>
@@ -1794,7 +2057,7 @@
               <v:stroke joinstyle="miter"/>
               <v:path gradientshapeok="t" o:connecttype="rect"/>
             </v:shapetype>
-            <v:shape id="Text Box 11" o:spid="_x0000_s1029" type="#_x0000_t202" alt="OFFICIAL" style="position:absolute;left:0;text-align:left;margin-left:0;margin-top:0;width:34.95pt;height:34.95pt;z-index:251666432;visibility:visible;mso-wrap-style:none;mso-wrap-distance-left:0;mso-wrap-distance-top:0;mso-wrap-distance-right:0;mso-wrap-distance-bottom:0;mso-position-horizontal:center;mso-position-horizontal-relative:page;mso-position-vertical:bottom;mso-position-vertical-relative:page;v-text-anchor:bottom" o:gfxdata="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" filled="f" stroked="f">
+            <v:shape id="Text Box 11" o:spid="_x0000_s1029" type="#_x0000_t202" alt="OFFICIAL" style="position:absolute;left:0;text-align:left;margin-left:0;margin-top:0;width:34.95pt;height:34.95pt;z-index:251658247;visibility:visible;mso-wrap-style:none;mso-wrap-distance-left:0;mso-wrap-distance-top:0;mso-wrap-distance-right:0;mso-wrap-distance-bottom:0;mso-position-horizontal:center;mso-position-horizontal-relative:page;mso-position-vertical:bottom;mso-position-vertical-relative:page;v-text-anchor:bottom" o:gfxdata="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" filled="f" stroked="f">
               <v:textbox style="mso-fit-shape-to-text:t" inset="0,0,0,15pt">
                 <w:txbxContent>
                   <w:p>
@@ -1956,7 +2219,7 @@
       <mc:AlternateContent>
         <mc:Choice Requires="wps">
           <w:drawing>
-            <wp:anchor distT="0" distB="0" distL="0" distR="0" simplePos="0" relativeHeight="251664384" behindDoc="0" locked="0" layoutInCell="1" allowOverlap="1" wp14:anchorId="4306C380" wp14:editId="3F2B86FA">
+            <wp:anchor distT="0" distB="0" distL="0" distR="0" simplePos="0" relativeHeight="251658245" behindDoc="0" locked="0" layoutInCell="1" allowOverlap="1" wp14:anchorId="4306C380" wp14:editId="3F2B86FA">
               <wp:simplePos x="635" y="635"/>
               <wp:positionH relativeFrom="page">
                 <wp:align>center</wp:align>
@@ -2035,7 +2298,7 @@
               <v:stroke joinstyle="miter"/>
               <v:path gradientshapeok="t" o:connecttype="rect"/>
             </v:shapetype>
-            <v:shape id="Text Box 9" o:spid="_x0000_s1031" type="#_x0000_t202" alt="OFFICIAL" style="position:absolute;margin-left:0;margin-top:0;width:34.95pt;height:34.95pt;z-index:251664384;visibility:visible;mso-wrap-style:none;mso-wrap-distance-left:0;mso-wrap-distance-top:0;mso-wrap-distance-right:0;mso-wrap-distance-bottom:0;mso-position-horizontal:center;mso-position-horizontal-relative:page;mso-position-vertical:bottom;mso-position-vertical-relative:page;v-text-anchor:bottom" o:gfxdata="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" filled="f" stroked="f">
+            <v:shape id="Text Box 9" o:spid="_x0000_s1031" type="#_x0000_t202" alt="OFFICIAL" style="position:absolute;margin-left:0;margin-top:0;width:34.95pt;height:34.95pt;z-index:251658245;visibility:visible;mso-wrap-style:none;mso-wrap-distance-left:0;mso-wrap-distance-top:0;mso-wrap-distance-right:0;mso-wrap-distance-bottom:0;mso-position-horizontal:center;mso-position-horizontal-relative:page;mso-position-vertical:bottom;mso-position-vertical-relative:page;v-text-anchor:bottom" o:gfxdata="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" filled="f" stroked="f">
               <v:textbox style="mso-fit-shape-to-text:t" inset="0,0,0,15pt">
                 <w:txbxContent>
                   <w:p>
@@ -2109,7 +2372,7 @@
       <mc:AlternateContent>
         <mc:Choice Requires="wps">
           <w:drawing>
-            <wp:anchor distT="0" distB="0" distL="0" distR="0" simplePos="0" relativeHeight="251662336" behindDoc="0" locked="0" layoutInCell="1" allowOverlap="1" wp14:anchorId="631ECB5C" wp14:editId="3835DCF3">
+            <wp:anchor distT="0" distB="0" distL="0" distR="0" simplePos="0" relativeHeight="251658243" behindDoc="0" locked="0" layoutInCell="1" allowOverlap="1" wp14:anchorId="631ECB5C" wp14:editId="3835DCF3">
               <wp:simplePos x="635" y="635"/>
               <wp:positionH relativeFrom="page">
                 <wp:align>center</wp:align>
@@ -2188,7 +2451,7 @@
               <v:stroke joinstyle="miter"/>
               <v:path gradientshapeok="t" o:connecttype="rect"/>
             </v:shapetype>
-            <v:shape id="Text Box 7" o:spid="_x0000_s1026" type="#_x0000_t202" alt="OFFICIAL" style="position:absolute;margin-left:0;margin-top:0;width:34.95pt;height:34.95pt;z-index:251662336;visibility:visible;mso-wrap-style:none;mso-wrap-distance-left:0;mso-wrap-distance-top:0;mso-wrap-distance-right:0;mso-wrap-distance-bottom:0;mso-position-horizontal:center;mso-position-horizontal-relative:page;mso-position-vertical:top;mso-position-vertical-relative:page;v-text-anchor:top" o:gfxdata="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" filled="f" stroked="f">
+            <v:shape id="Text Box 7" o:spid="_x0000_s1026" type="#_x0000_t202" alt="OFFICIAL" style="position:absolute;margin-left:0;margin-top:0;width:34.95pt;height:34.95pt;z-index:251658243;visibility:visible;mso-wrap-style:none;mso-wrap-distance-left:0;mso-wrap-distance-top:0;mso-wrap-distance-right:0;mso-wrap-distance-bottom:0;mso-position-horizontal:center;mso-position-horizontal-relative:page;mso-position-vertical:top;mso-position-vertical-relative:page;v-text-anchor:top" o:gfxdata="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" filled="f" stroked="f">
               <v:textbox style="mso-fit-shape-to-text:t" inset="0,15pt,0,0">
                 <w:txbxContent>
                   <w:p>
@@ -2251,7 +2514,7 @@
       <mc:AlternateContent>
         <mc:Choice Requires="wps">
           <w:drawing>
-            <wp:anchor distT="0" distB="0" distL="0" distR="0" simplePos="0" relativeHeight="251663360" behindDoc="0" locked="0" layoutInCell="1" allowOverlap="1" wp14:anchorId="135A8C5A" wp14:editId="50E24DD2">
+            <wp:anchor distT="0" distB="0" distL="0" distR="0" simplePos="0" relativeHeight="251658244" behindDoc="0" locked="0" layoutInCell="1" allowOverlap="1" wp14:anchorId="135A8C5A" wp14:editId="50E24DD2">
               <wp:simplePos x="914400" y="0"/>
               <wp:positionH relativeFrom="page">
                 <wp:align>center</wp:align>
@@ -2330,7 +2593,7 @@
               <v:stroke joinstyle="miter"/>
               <v:path gradientshapeok="t" o:connecttype="rect"/>
             </v:shapetype>
-            <v:shape id="Text Box 8" o:spid="_x0000_s1027" type="#_x0000_t202" alt="OFFICIAL" style="position:absolute;left:0;text-align:left;margin-left:0;margin-top:0;width:34.95pt;height:34.95pt;z-index:251663360;visibility:visible;mso-wrap-style:none;mso-wrap-distance-left:0;mso-wrap-distance-top:0;mso-wrap-distance-right:0;mso-wrap-distance-bottom:0;mso-position-horizontal:center;mso-position-horizontal-relative:page;mso-position-vertical:top;mso-position-vertical-relative:page;v-text-anchor:top" o:gfxdata="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" filled="f" stroked="f">
+            <v:shape id="Text Box 8" o:spid="_x0000_s1027" type="#_x0000_t202" alt="OFFICIAL" style="position:absolute;left:0;text-align:left;margin-left:0;margin-top:0;width:34.95pt;height:34.95pt;z-index:251658244;visibility:visible;mso-wrap-style:none;mso-wrap-distance-left:0;mso-wrap-distance-top:0;mso-wrap-distance-right:0;mso-wrap-distance-bottom:0;mso-position-horizontal:center;mso-position-horizontal-relative:page;mso-position-vertical:top;mso-position-vertical-relative:page;v-text-anchor:top" o:gfxdata="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" filled="f" stroked="f">
               <v:textbox style="mso-fit-shape-to-text:t" inset="0,15pt,0,0">
                 <w:txbxContent>
                   <w:p>
@@ -2396,7 +2659,7 @@
         <w:color w:val="FF5E0E"/>
       </w:rPr>
       <w:drawing>
-        <wp:anchor distT="0" distB="0" distL="114300" distR="114300" simplePos="0" relativeHeight="251660288" behindDoc="0" locked="0" layoutInCell="1" allowOverlap="1" wp14:anchorId="3126EA67" wp14:editId="3CFB3E98">
+        <wp:anchor distT="0" distB="0" distL="114300" distR="114300" simplePos="0" relativeHeight="251658241" behindDoc="0" locked="0" layoutInCell="1" allowOverlap="1" wp14:anchorId="3126EA67" wp14:editId="3CFB3E98">
           <wp:simplePos x="0" y="0"/>
           <wp:positionH relativeFrom="column">
             <wp:posOffset>0</wp:posOffset>
@@ -2522,7 +2785,7 @@
       <mc:AlternateContent>
         <mc:Choice Requires="wps">
           <w:drawing>
-            <wp:anchor distT="0" distB="0" distL="0" distR="0" simplePos="0" relativeHeight="251661312" behindDoc="0" locked="0" layoutInCell="1" allowOverlap="1" wp14:anchorId="46AA1AB3" wp14:editId="1C8F059D">
+            <wp:anchor distT="0" distB="0" distL="0" distR="0" simplePos="0" relativeHeight="251658242" behindDoc="0" locked="0" layoutInCell="1" allowOverlap="1" wp14:anchorId="46AA1AB3" wp14:editId="1C8F059D">
               <wp:simplePos x="635" y="635"/>
               <wp:positionH relativeFrom="page">
                 <wp:align>center</wp:align>
@@ -2601,7 +2864,7 @@
               <v:stroke joinstyle="miter"/>
               <v:path gradientshapeok="t" o:connecttype="rect"/>
             </v:shapetype>
-            <v:shape id="Text Box 4" o:spid="_x0000_s1030" type="#_x0000_t202" alt="OFFICIAL" style="position:absolute;left:0;text-align:left;margin-left:0;margin-top:0;width:34.95pt;height:34.95pt;z-index:251661312;visibility:visible;mso-wrap-style:none;mso-wrap-distance-left:0;mso-wrap-distance-top:0;mso-wrap-distance-right:0;mso-wrap-distance-bottom:0;mso-position-horizontal:center;mso-position-horizontal-relative:page;mso-position-vertical:top;mso-position-vertical-relative:page;v-text-anchor:top" o:gfxdata="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" filled="f" stroked="f">
+            <v:shape id="Text Box 4" o:spid="_x0000_s1030" type="#_x0000_t202" alt="OFFICIAL" style="position:absolute;left:0;text-align:left;margin-left:0;margin-top:0;width:34.95pt;height:34.95pt;z-index:251658242;visibility:visible;mso-wrap-style:none;mso-wrap-distance-left:0;mso-wrap-distance-top:0;mso-wrap-distance-right:0;mso-wrap-distance-bottom:0;mso-position-horizontal:center;mso-position-horizontal-relative:page;mso-position-vertical:top;mso-position-vertical-relative:page;v-text-anchor:top" o:gfxdata="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" filled="f" stroked="f">
               <v:textbox style="mso-fit-shape-to-text:t" inset="0,15pt,0,0">
                 <w:txbxContent>
                   <w:p>
@@ -4515,6 +4778,7 @@
   <w:style w:type="character" w:default="1" w:styleId="DefaultParagraphFont">
     <w:name w:val="Default Paragraph Font"/>
     <w:uiPriority w:val="1"/>
+    <w:semiHidden/>
     <w:unhideWhenUsed/>
   </w:style>
   <w:style w:type="table" w:default="1" w:styleId="TableNormal">
@@ -5039,6 +5303,6 @@
 
 <file path=docMetadata/LabelInfo.xml><?xml version="1.0" encoding="utf-8"?>
 <clbl:labelList xmlns:clbl="http://schemas.microsoft.com/office/2020/mipLabelMetadata">
-  <clbl:label id="{70663b86-f2b7-4b32-b286-17269b5dc83f}" enabled="1" method="Standard" siteId="{19537222-55d7-4581-84fb-c2da6e835c74}" contentBits="3" removed="0"/>
+  <clbl:label id="{70663b86-f2b7-4b32-b286-17269b5dc83f}" enabled="1" method="Standard" siteId="{19537222-55d7-4581-84fb-c2da6e835c74}" removed="0"/>
 </clbl:labelList>
 </file>
</xml_diff>